<commit_message>
Release v10 complete thesis workflow with dual Office validation
</commit_message>
<xml_diff>
--- a/fit-thesis-format/assets/fit-economics-management-template-clean.docx
+++ b/fit-thesis-format/assets/fit-economics-management-template-clean.docx
@@ -433,7 +433,7 @@
                 <w:sz w:val="32"/>
                 <w:szCs w:val="32"/>
               </w:rPr>
-              <w:t>李四</w:t>
+              <w:t xml:space="preserve">  </w:t>
             </w:r>
             <w:r>
               <w:rPr>
@@ -532,7 +532,7 @@
                 <w:sz w:val="32"/>
                 <w:szCs w:val="32"/>
               </w:rPr>
-              <w:t>098605569</w:t>
+              <w:t xml:space="preserve">         </w:t>
             </w:r>
           </w:p>
         </w:tc>

</xml_diff>